<commit_message>
actualizacion de documentacion de entregable 1
</commit_message>
<xml_diff>
--- a/DOCUMENTACION/ENTREGABLE #1.docx
+++ b/DOCUMENTACION/ENTREGABLE #1.docx
@@ -253,6 +253,20 @@
         </w:rPr>
         <w:t>304880229</w:t>
       </w:r>
+      <w:r>
+        <w:rPr>
+          <w:sz w:val="32"/>
+          <w:szCs w:val="32"/>
+        </w:rPr>
+        <w:br/>
+      </w:r>
+      <w:r>
+        <w:rPr>
+          <w:sz w:val="32"/>
+          <w:szCs w:val="32"/>
+        </w:rPr>
+        <w:t>114310767</w:t>
+      </w:r>
     </w:p>
     <w:p>
       <w:pPr>
@@ -264,6 +278,13 @@
           <w:szCs w:val="32"/>
         </w:rPr>
       </w:pPr>
+      <w:r>
+        <w:rPr>
+          <w:sz w:val="32"/>
+          <w:szCs w:val="32"/>
+        </w:rPr>
+        <w:t>FECHA DE ENTREGA</w:t>
+      </w:r>
     </w:p>
     <w:p>
       <w:pPr>
@@ -280,7 +301,7 @@
           <w:sz w:val="32"/>
           <w:szCs w:val="32"/>
         </w:rPr>
-        <w:t>FECHA DE ENTREGA</w:t>
+        <w:t>22-05-2026</w:t>
       </w:r>
     </w:p>
     <w:p>
@@ -289,16 +310,17 @@
         <w:ind w:left="708"/>
         <w:jc w:val="center"/>
         <w:rPr>
-          <w:sz w:val="32"/>
-          <w:szCs w:val="32"/>
-        </w:rPr>
-      </w:pPr>
-      <w:r>
-        <w:rPr>
-          <w:sz w:val="32"/>
-          <w:szCs w:val="32"/>
-        </w:rPr>
-        <w:t>22-05-2026</w:t>
+          <w:b/>
+          <w:bCs/>
+        </w:rPr>
+      </w:pPr>
+      <w:r>
+        <w:rPr>
+          <w:b/>
+          <w:bCs/>
+        </w:rPr>
+        <w:lastRenderedPageBreak/>
+        <w:t>INDICE</w:t>
       </w:r>
     </w:p>
     <w:p>
@@ -311,25 +333,6 @@
           <w:bCs/>
         </w:rPr>
       </w:pPr>
-      <w:r>
-        <w:rPr>
-          <w:b/>
-          <w:bCs/>
-        </w:rPr>
-        <w:lastRenderedPageBreak/>
-        <w:t>INDICE</w:t>
-      </w:r>
-    </w:p>
-    <w:p>
-      <w:pPr>
-        <w:spacing w:line="360" w:lineRule="auto"/>
-        <w:ind w:left="708"/>
-        <w:jc w:val="center"/>
-        <w:rPr>
-          <w:b/>
-          <w:bCs/>
-        </w:rPr>
-      </w:pPr>
     </w:p>
     <w:p>
       <w:pPr>
@@ -664,9 +667,884 @@
         <w:t>Anexos</w:t>
       </w:r>
     </w:p>
+    <w:p>
+      <w:pPr>
+        <w:spacing w:line="360" w:lineRule="auto"/>
+      </w:pPr>
+    </w:p>
+    <w:p>
+      <w:pPr>
+        <w:spacing w:line="360" w:lineRule="auto"/>
+      </w:pPr>
+    </w:p>
+    <w:p>
+      <w:pPr>
+        <w:spacing w:line="360" w:lineRule="auto"/>
+      </w:pPr>
+    </w:p>
+    <w:p>
+      <w:pPr>
+        <w:pStyle w:val="Prrafodelista"/>
+        <w:numPr>
+          <w:ilvl w:val="1"/>
+          <w:numId w:val="2"/>
+        </w:numPr>
+        <w:spacing w:line="360" w:lineRule="auto"/>
+        <w:jc w:val="center"/>
+      </w:pPr>
+      <w:r>
+        <w:lastRenderedPageBreak/>
+        <w:t>INTRODUCCIÓN</w:t>
+      </w:r>
+    </w:p>
+    <w:p>
+      <w:pPr>
+        <w:spacing w:line="360" w:lineRule="auto"/>
+        <w:ind w:left="360" w:firstLine="348"/>
+        <w:jc w:val="both"/>
+      </w:pPr>
+      <w:r>
+        <w:t>El presente proyecto tiene como finalidad el desarrollo de un sistema web de facturación para una panadería,</w:t>
+      </w:r>
+      <w:r>
+        <w:t xml:space="preserve"> con el propósito de mejorar el control administrativo y operativo de la empresa mediante la automatización de procesos relacionados con ventas y gestión de clientes.</w:t>
+      </w:r>
+    </w:p>
+    <w:p>
+      <w:pPr>
+        <w:spacing w:line="360" w:lineRule="auto"/>
+        <w:ind w:left="360" w:firstLine="348"/>
+        <w:jc w:val="both"/>
+      </w:pPr>
+      <w:r>
+        <w:t>Actualmente, la empresa presenta dificultades en el manejo de facturación y el control de información, debido a que gran parte de los procesos se realizan de forma manual o mediante herramientas poco eficientes, lo que genera atrasos, errores en los registros y dificultades para llevar un control adecuado de las operaciones diarias.</w:t>
+      </w:r>
+    </w:p>
+    <w:p>
+      <w:pPr>
+        <w:spacing w:line="360" w:lineRule="auto"/>
+        <w:ind w:left="360" w:firstLine="348"/>
+        <w:jc w:val="both"/>
+      </w:pPr>
+      <w:r>
+        <w:t>Ante esta situación, se propone el desarrollo de un sistema informático que permita optimizar los procesos internos de la panadería, facilitando la generación de facturas, el control de productos, la administración de clientes y la generación de reportes administrativos.</w:t>
+      </w:r>
+    </w:p>
+    <w:p>
+      <w:pPr>
+        <w:spacing w:line="360" w:lineRule="auto"/>
+        <w:ind w:left="360" w:firstLine="348"/>
+        <w:jc w:val="both"/>
+      </w:pPr>
+      <w:r>
+        <w:t>El sistema será desarrollado utilizando el lenguaje de programación Python mediante el framework Django, junto con el motor de base de datos MYSQL, permitiendo contar con una plataforma</w:t>
+      </w:r>
+      <w:r>
+        <w:t xml:space="preserve"> moderna, segura y eficiente para el manejo de la información de la empresa.</w:t>
+      </w:r>
+    </w:p>
+    <w:p>
+      <w:pPr>
+        <w:spacing w:line="360" w:lineRule="auto"/>
+        <w:ind w:left="360" w:firstLine="348"/>
+        <w:jc w:val="both"/>
+      </w:pPr>
+      <w:r>
+        <w:t>Con la implementación de este proyecto se espera mejorar la eficiencia operativa de la panadería, reducir errores administrativos, agilizar los procesos internos y facilitar la toma de decisiones mediante el acceso rápido y ordenado a la información.</w:t>
+      </w:r>
+    </w:p>
+    <w:p>
+      <w:pPr>
+        <w:jc w:val="both"/>
+      </w:pPr>
+      <w:r>
+        <w:br w:type="page"/>
+      </w:r>
+    </w:p>
+    <w:p>
+      <w:pPr>
+        <w:pStyle w:val="Prrafodelista"/>
+        <w:numPr>
+          <w:ilvl w:val="1"/>
+          <w:numId w:val="2"/>
+        </w:numPr>
+        <w:spacing w:line="360" w:lineRule="auto"/>
+      </w:pPr>
+      <w:r>
+        <w:rPr>
+          <w:b/>
+          <w:bCs/>
+        </w:rPr>
+        <w:lastRenderedPageBreak/>
+        <w:t>OBJETIVOS DEL PROYECTO</w:t>
+      </w:r>
+      <w:r>
+        <w:rPr>
+          <w:b/>
+          <w:bCs/>
+        </w:rPr>
+        <w:br/>
+      </w:r>
+      <w:r>
+        <w:t>A continuación, se presentan los objetivos del presente proyecto profesional informático</w:t>
+      </w:r>
+    </w:p>
+    <w:p>
+      <w:pPr>
+        <w:pStyle w:val="Prrafodelista"/>
+        <w:numPr>
+          <w:ilvl w:val="2"/>
+          <w:numId w:val="2"/>
+        </w:numPr>
+        <w:spacing w:line="360" w:lineRule="auto"/>
+        <w:rPr>
+          <w:b/>
+          <w:bCs/>
+        </w:rPr>
+      </w:pPr>
+      <w:r>
+        <w:rPr>
+          <w:b/>
+          <w:bCs/>
+        </w:rPr>
+        <w:t xml:space="preserve"> OBJETIVO GENERAL</w:t>
+      </w:r>
+    </w:p>
+    <w:p>
+      <w:pPr>
+        <w:pStyle w:val="Prrafodelista"/>
+        <w:numPr>
+          <w:ilvl w:val="0"/>
+          <w:numId w:val="3"/>
+        </w:numPr>
+        <w:spacing w:line="360" w:lineRule="auto"/>
+        <w:rPr>
+          <w:b/>
+          <w:bCs/>
+        </w:rPr>
+      </w:pPr>
+      <w:r>
+        <w:t>Que el estudiante demuestre que es capaz de aplicar en forma exitosa los conocimientos adquiridos en el transcurso de los ocho cuatrimestres y 32 cursos que comprenden el Bachillerato en Ingeniería en Sistemas Computacionales.</w:t>
+      </w:r>
+    </w:p>
+    <w:p>
+      <w:pPr>
+        <w:pStyle w:val="Prrafodelista"/>
+        <w:numPr>
+          <w:ilvl w:val="2"/>
+          <w:numId w:val="2"/>
+        </w:numPr>
+        <w:spacing w:line="360" w:lineRule="auto"/>
+        <w:rPr>
+          <w:b/>
+          <w:bCs/>
+        </w:rPr>
+      </w:pPr>
+      <w:r>
+        <w:rPr>
+          <w:b/>
+          <w:bCs/>
+        </w:rPr>
+        <w:t>OBJETIVOS ESPECIFICOS</w:t>
+      </w:r>
+    </w:p>
+    <w:p>
+      <w:pPr>
+        <w:pStyle w:val="Prrafodelista"/>
+        <w:numPr>
+          <w:ilvl w:val="0"/>
+          <w:numId w:val="3"/>
+        </w:numPr>
+        <w:spacing w:line="360" w:lineRule="auto"/>
+        <w:rPr>
+          <w:b/>
+          <w:bCs/>
+        </w:rPr>
+      </w:pPr>
+      <w:r>
+        <w:t>Desarrollar un software en una empresa</w:t>
+      </w:r>
+    </w:p>
+    <w:p>
+      <w:pPr>
+        <w:pStyle w:val="Prrafodelista"/>
+        <w:numPr>
+          <w:ilvl w:val="0"/>
+          <w:numId w:val="3"/>
+        </w:numPr>
+        <w:spacing w:line="360" w:lineRule="auto"/>
+        <w:rPr>
+          <w:b/>
+          <w:bCs/>
+        </w:rPr>
+      </w:pPr>
+      <w:r>
+        <w:t>Aplicar en el desarrollo las etapas del ciclo de vida del desarrollo de un software</w:t>
+      </w:r>
+    </w:p>
+    <w:p>
+      <w:pPr>
+        <w:pStyle w:val="Prrafodelista"/>
+        <w:numPr>
+          <w:ilvl w:val="0"/>
+          <w:numId w:val="3"/>
+        </w:numPr>
+        <w:spacing w:line="360" w:lineRule="auto"/>
+        <w:rPr>
+          <w:b/>
+          <w:bCs/>
+        </w:rPr>
+      </w:pPr>
+      <w:r>
+        <w:t>Demostrar que el software ha contribuido a producir una mejora significativamente en la empresa</w:t>
+      </w:r>
+    </w:p>
+    <w:p>
+      <w:pPr>
+        <w:pStyle w:val="Prrafodelista"/>
+        <w:numPr>
+          <w:ilvl w:val="0"/>
+          <w:numId w:val="3"/>
+        </w:numPr>
+        <w:spacing w:line="360" w:lineRule="auto"/>
+        <w:rPr>
+          <w:b/>
+          <w:bCs/>
+        </w:rPr>
+      </w:pPr>
+      <w:r>
+        <w:t>Exponer en compañía del usuario el software realizado, sus bondades y el manejo eficiente del mismo por parte del usuario.</w:t>
+      </w:r>
+      <w:r>
+        <w:tab/>
+      </w:r>
+    </w:p>
+    <w:p>
+      <w:pPr>
+        <w:pStyle w:val="Prrafodelista"/>
+        <w:numPr>
+          <w:ilvl w:val="1"/>
+          <w:numId w:val="2"/>
+        </w:numPr>
+        <w:spacing w:line="360" w:lineRule="auto"/>
+        <w:rPr>
+          <w:b/>
+          <w:bCs/>
+        </w:rPr>
+      </w:pPr>
+      <w:r>
+        <w:rPr>
+          <w:b/>
+          <w:bCs/>
+        </w:rPr>
+        <w:t>JUSTIFICACIÓN DEL PROYECTO</w:t>
+      </w:r>
+    </w:p>
+    <w:p>
+      <w:pPr>
+        <w:spacing w:line="360" w:lineRule="auto"/>
+        <w:ind w:firstLine="360"/>
+        <w:jc w:val="both"/>
+      </w:pPr>
+      <w:r>
+        <w:t>La implementación de un sistema web de facturación surge como una necesidad para mejorar los procesos administrativos y operativos de la panadería, debido a que actualmente muchos de los procedimientos se realizan de manera manual o mediante herramientas poco eficientes, lo que dificulta el control adecuado de la información.</w:t>
+      </w:r>
+    </w:p>
+    <w:p>
+      <w:pPr>
+        <w:spacing w:line="360" w:lineRule="auto"/>
+        <w:ind w:firstLine="360"/>
+        <w:jc w:val="both"/>
+      </w:pPr>
+      <w:r>
+        <w:t>El desarrollo de este proyecto permitirá automatizar tareas relacionadas con la facturación, administración de productos y gestión de clientes, reduciendo errores humanos y mejorando la organización de los datos dentro de la empresa.</w:t>
+      </w:r>
+    </w:p>
+    <w:p>
+      <w:pPr>
+        <w:spacing w:line="360" w:lineRule="auto"/>
+        <w:ind w:firstLine="360"/>
+        <w:jc w:val="both"/>
+      </w:pPr>
+      <w:r>
+        <w:t>Asimismo, el sistema contribuirá a optimizar el tiempo de atención al cliente, mejorar el control de ventas y facilitar la generación de reportes administrativos que permitan a la empresa tomar decisiones de forma más rápida y eficiente.</w:t>
+      </w:r>
+    </w:p>
+    <w:p>
+      <w:pPr>
+        <w:spacing w:line="360" w:lineRule="auto"/>
+        <w:ind w:firstLine="360"/>
+        <w:jc w:val="both"/>
+      </w:pPr>
+      <w:r>
+        <w:t>Desde el punto de vista tecnológico, el proyecto permitirá implementar herramientas modernas de desarrollo web utilizando Python, Django y MySQL, brindando una solución segura, escalable y adaptable a las necesidades de la empresa.</w:t>
+      </w:r>
+    </w:p>
+    <w:p>
+      <w:pPr>
+        <w:spacing w:line="360" w:lineRule="auto"/>
+        <w:ind w:firstLine="360"/>
+        <w:jc w:val="both"/>
+      </w:pPr>
+      <w:r>
+        <w:t>Además, este proyecto representa una oportunidad para aplicar los conocimientos adquiridos durante la formación académica, desarrollando una solución informática orientada a resolver una problemática real dentro de una empresa.</w:t>
+      </w:r>
+    </w:p>
+    <w:p>
+      <w:pPr>
+        <w:pStyle w:val="Prrafodelista"/>
+        <w:numPr>
+          <w:ilvl w:val="1"/>
+          <w:numId w:val="2"/>
+        </w:numPr>
+        <w:spacing w:line="360" w:lineRule="auto"/>
+        <w:jc w:val="both"/>
+        <w:rPr>
+          <w:b/>
+          <w:bCs/>
+        </w:rPr>
+      </w:pPr>
+      <w:r>
+        <w:rPr>
+          <w:b/>
+          <w:bCs/>
+        </w:rPr>
+        <w:lastRenderedPageBreak/>
+        <w:t>DESCRIPCION DE LA EMPRESA</w:t>
+      </w:r>
+    </w:p>
+    <w:p>
+      <w:pPr>
+        <w:pStyle w:val="Prrafodelista"/>
+        <w:numPr>
+          <w:ilvl w:val="2"/>
+          <w:numId w:val="2"/>
+        </w:numPr>
+        <w:spacing w:line="360" w:lineRule="auto"/>
+        <w:jc w:val="both"/>
+        <w:rPr>
+          <w:b/>
+          <w:bCs/>
+        </w:rPr>
+      </w:pPr>
+      <w:r>
+        <w:rPr>
+          <w:b/>
+          <w:bCs/>
+        </w:rPr>
+        <w:t>RESEÑA HISTORICA DE LA EMPRESA</w:t>
+      </w:r>
+    </w:p>
+    <w:p>
+      <w:pPr>
+        <w:pStyle w:val="Prrafodelista"/>
+        <w:numPr>
+          <w:ilvl w:val="2"/>
+          <w:numId w:val="2"/>
+        </w:numPr>
+        <w:spacing w:line="360" w:lineRule="auto"/>
+        <w:jc w:val="both"/>
+        <w:rPr>
+          <w:b/>
+          <w:bCs/>
+        </w:rPr>
+      </w:pPr>
+      <w:r>
+        <w:rPr>
+          <w:b/>
+          <w:bCs/>
+        </w:rPr>
+        <w:t>MISION Y VISION</w:t>
+      </w:r>
+    </w:p>
+    <w:p>
+      <w:pPr>
+        <w:pStyle w:val="Prrafodelista"/>
+        <w:numPr>
+          <w:ilvl w:val="3"/>
+          <w:numId w:val="2"/>
+        </w:numPr>
+        <w:spacing w:line="360" w:lineRule="auto"/>
+        <w:jc w:val="both"/>
+        <w:rPr>
+          <w:b/>
+          <w:bCs/>
+        </w:rPr>
+      </w:pPr>
+      <w:r>
+        <w:rPr>
+          <w:b/>
+          <w:bCs/>
+        </w:rPr>
+        <w:t>MISION</w:t>
+      </w:r>
+    </w:p>
+    <w:p>
+      <w:pPr>
+        <w:pStyle w:val="Prrafodelista"/>
+        <w:numPr>
+          <w:ilvl w:val="3"/>
+          <w:numId w:val="2"/>
+        </w:numPr>
+        <w:spacing w:line="360" w:lineRule="auto"/>
+        <w:jc w:val="both"/>
+        <w:rPr>
+          <w:b/>
+          <w:bCs/>
+        </w:rPr>
+      </w:pPr>
+      <w:r>
+        <w:rPr>
+          <w:b/>
+          <w:bCs/>
+        </w:rPr>
+        <w:t>VISION</w:t>
+      </w:r>
+    </w:p>
+    <w:p>
+      <w:pPr>
+        <w:pStyle w:val="Prrafodelista"/>
+        <w:numPr>
+          <w:ilvl w:val="2"/>
+          <w:numId w:val="2"/>
+        </w:numPr>
+        <w:spacing w:line="360" w:lineRule="auto"/>
+        <w:jc w:val="both"/>
+        <w:rPr>
+          <w:b/>
+          <w:bCs/>
+        </w:rPr>
+      </w:pPr>
+      <w:r>
+        <w:rPr>
+          <w:b/>
+          <w:bCs/>
+        </w:rPr>
+        <w:t>OBJETIVOS ESTRATEGICOS DE LA EMPRESA</w:t>
+      </w:r>
+    </w:p>
+    <w:p>
+      <w:pPr>
+        <w:pStyle w:val="Prrafodelista"/>
+        <w:numPr>
+          <w:ilvl w:val="3"/>
+          <w:numId w:val="2"/>
+        </w:numPr>
+        <w:spacing w:line="360" w:lineRule="auto"/>
+        <w:jc w:val="both"/>
+        <w:rPr>
+          <w:b/>
+          <w:bCs/>
+        </w:rPr>
+      </w:pPr>
+      <w:r>
+        <w:rPr>
+          <w:b/>
+          <w:bCs/>
+        </w:rPr>
+        <w:t>OBJETIVO GENERAL</w:t>
+      </w:r>
+    </w:p>
+    <w:p>
+      <w:pPr>
+        <w:pStyle w:val="Prrafodelista"/>
+        <w:numPr>
+          <w:ilvl w:val="3"/>
+          <w:numId w:val="2"/>
+        </w:numPr>
+        <w:spacing w:line="360" w:lineRule="auto"/>
+        <w:jc w:val="both"/>
+        <w:rPr>
+          <w:b/>
+          <w:bCs/>
+        </w:rPr>
+      </w:pPr>
+      <w:r>
+        <w:rPr>
+          <w:b/>
+          <w:bCs/>
+        </w:rPr>
+        <w:t>OBJETIVOS ESPECIFICOS</w:t>
+      </w:r>
+    </w:p>
+    <w:p>
+      <w:pPr>
+        <w:pStyle w:val="Prrafodelista"/>
+        <w:numPr>
+          <w:ilvl w:val="2"/>
+          <w:numId w:val="2"/>
+        </w:numPr>
+        <w:spacing w:line="360" w:lineRule="auto"/>
+        <w:jc w:val="both"/>
+        <w:rPr>
+          <w:b/>
+          <w:bCs/>
+        </w:rPr>
+      </w:pPr>
+      <w:r>
+        <w:rPr>
+          <w:b/>
+          <w:bCs/>
+        </w:rPr>
+        <w:t>ACTIVIDADES DE LA EMPRESA</w:t>
+      </w:r>
+    </w:p>
+    <w:p>
+      <w:pPr>
+        <w:pStyle w:val="Prrafodelista"/>
+        <w:numPr>
+          <w:ilvl w:val="2"/>
+          <w:numId w:val="2"/>
+        </w:numPr>
+        <w:spacing w:line="360" w:lineRule="auto"/>
+        <w:jc w:val="both"/>
+        <w:rPr>
+          <w:b/>
+          <w:bCs/>
+        </w:rPr>
+      </w:pPr>
+      <w:r>
+        <w:rPr>
+          <w:b/>
+          <w:bCs/>
+        </w:rPr>
+        <w:t>ESTRUCTURA DE LA EMPRESA (ORGANIGRAMA)</w:t>
+      </w:r>
+    </w:p>
+    <w:p>
+      <w:pPr>
+        <w:pStyle w:val="Prrafodelista"/>
+        <w:numPr>
+          <w:ilvl w:val="2"/>
+          <w:numId w:val="2"/>
+        </w:numPr>
+        <w:spacing w:line="360" w:lineRule="auto"/>
+        <w:jc w:val="both"/>
+        <w:rPr>
+          <w:b/>
+          <w:bCs/>
+        </w:rPr>
+      </w:pPr>
+      <w:r>
+        <w:rPr>
+          <w:b/>
+          <w:bCs/>
+        </w:rPr>
+        <w:t>EXPECTATIVAS DE LA EMPRESA</w:t>
+      </w:r>
+    </w:p>
+    <w:p>
+      <w:pPr>
+        <w:pStyle w:val="Prrafodelista"/>
+        <w:numPr>
+          <w:ilvl w:val="2"/>
+          <w:numId w:val="2"/>
+        </w:numPr>
+        <w:spacing w:line="360" w:lineRule="auto"/>
+        <w:jc w:val="both"/>
+        <w:rPr>
+          <w:b/>
+          <w:bCs/>
+        </w:rPr>
+      </w:pPr>
+      <w:r>
+        <w:rPr>
+          <w:b/>
+          <w:bCs/>
+        </w:rPr>
+        <w:t>ASPECTOS GENERALES DE LA EMPRESA</w:t>
+      </w:r>
+    </w:p>
+    <w:p>
+      <w:pPr>
+        <w:pStyle w:val="Prrafodelista"/>
+        <w:numPr>
+          <w:ilvl w:val="2"/>
+          <w:numId w:val="2"/>
+        </w:numPr>
+        <w:spacing w:line="360" w:lineRule="auto"/>
+        <w:jc w:val="both"/>
+        <w:rPr>
+          <w:b/>
+          <w:bCs/>
+        </w:rPr>
+      </w:pPr>
+      <w:r>
+        <w:rPr>
+          <w:b/>
+          <w:bCs/>
+        </w:rPr>
+        <w:t>CUADRO RESUMEN DE LA EMPRESA</w:t>
+      </w:r>
+    </w:p>
+    <w:p>
+      <w:pPr>
+        <w:pStyle w:val="Prrafodelista"/>
+        <w:numPr>
+          <w:ilvl w:val="1"/>
+          <w:numId w:val="2"/>
+        </w:numPr>
+        <w:spacing w:line="360" w:lineRule="auto"/>
+        <w:jc w:val="both"/>
+        <w:rPr>
+          <w:b/>
+          <w:bCs/>
+        </w:rPr>
+      </w:pPr>
+      <w:r>
+        <w:rPr>
+          <w:b/>
+          <w:bCs/>
+        </w:rPr>
+        <w:t>JUSTIFICACIÓN DEL PROBLEMA</w:t>
+      </w:r>
+    </w:p>
+    <w:p>
+      <w:pPr>
+        <w:pStyle w:val="Prrafodelista"/>
+        <w:spacing w:line="360" w:lineRule="auto"/>
+        <w:ind w:left="792" w:firstLine="624"/>
+        <w:jc w:val="both"/>
+      </w:pPr>
+      <w:r>
+        <w:t>Actualmente, la panadería presenta dificultades en el manejo y control de sus procesos administrativos, especialmente en las áreas de facturación y administración de información de clientes y productos.</w:t>
+      </w:r>
+    </w:p>
+    <w:p>
+      <w:pPr>
+        <w:pStyle w:val="Prrafodelista"/>
+        <w:spacing w:line="360" w:lineRule="auto"/>
+        <w:ind w:left="792" w:firstLine="624"/>
+        <w:jc w:val="both"/>
+      </w:pPr>
+      <w:r>
+        <w:t>Muchos de los registros se realizan manualmente, lo que genera riesgos de perdida de información, errores en cálculos, atrasos en la atención al cliente. Esta situación afecta directamente la eficiencia operativa de la empresa y dificulta el acceso rápido a la información necesaria para el control diario de las actividades comerciales.</w:t>
+      </w:r>
+    </w:p>
+    <w:p>
+      <w:pPr>
+        <w:pStyle w:val="Prrafodelista"/>
+        <w:spacing w:line="360" w:lineRule="auto"/>
+        <w:ind w:left="792" w:firstLine="624"/>
+        <w:jc w:val="both"/>
+      </w:pPr>
+      <w:r>
+        <w:t xml:space="preserve">Además, la empresa enfrenta inconvenientes relacionados con el manejo de facturación electrónica, lo que provoca complicaciones en el proceso de registro de ventas y organización de documentos administrativos. </w:t>
+      </w:r>
+    </w:p>
+    <w:p>
+      <w:pPr>
+        <w:pStyle w:val="Prrafodelista"/>
+        <w:spacing w:line="360" w:lineRule="auto"/>
+        <w:ind w:left="792" w:firstLine="624"/>
+        <w:jc w:val="both"/>
+      </w:pPr>
+      <w:r>
+        <w:t>La ausencia de un sistema centralizado también limita la generación de reportes de ventas, control de productos y seguimiento de movimientos realizados dentro de la empresa, dificultando la toma de decisiones y el control adecuado de las operaciones.</w:t>
+      </w:r>
+    </w:p>
+    <w:p>
+      <w:pPr>
+        <w:pStyle w:val="Prrafodelista"/>
+        <w:spacing w:line="360" w:lineRule="auto"/>
+        <w:ind w:left="792" w:firstLine="624"/>
+        <w:jc w:val="both"/>
+      </w:pPr>
+      <w:r>
+        <w:t>Por esta razón, se considera necesario desarrollar un sistema web que permita automatizar y mejorar estos procesos, proporcionando una herramienta informática que contribuya al orden, seguridad y eficiencia de la información manejada por la panadería.</w:t>
+      </w:r>
+    </w:p>
+    <w:p>
+      <w:pPr>
+        <w:pStyle w:val="Prrafodelista"/>
+        <w:spacing w:line="360" w:lineRule="auto"/>
+        <w:ind w:left="792" w:firstLine="624"/>
+        <w:jc w:val="both"/>
+      </w:pPr>
+    </w:p>
+    <w:p>
+      <w:pPr>
+        <w:pStyle w:val="Prrafodelista"/>
+        <w:spacing w:line="360" w:lineRule="auto"/>
+        <w:ind w:left="792" w:firstLine="624"/>
+        <w:jc w:val="both"/>
+      </w:pPr>
+    </w:p>
+    <w:p>
+      <w:pPr>
+        <w:pStyle w:val="Prrafodelista"/>
+        <w:numPr>
+          <w:ilvl w:val="1"/>
+          <w:numId w:val="2"/>
+        </w:numPr>
+        <w:spacing w:line="360" w:lineRule="auto"/>
+        <w:jc w:val="both"/>
+      </w:pPr>
+      <w:r>
+        <w:rPr>
+          <w:b/>
+          <w:bCs/>
+        </w:rPr>
+        <w:lastRenderedPageBreak/>
+        <w:t>CARTA DE SOLICITUD DEL PROYECTO EN LA EMPRESA</w:t>
+      </w:r>
+    </w:p>
+    <w:p>
+      <w:pPr>
+        <w:pStyle w:val="Prrafodelista"/>
+        <w:numPr>
+          <w:ilvl w:val="1"/>
+          <w:numId w:val="2"/>
+        </w:numPr>
+        <w:spacing w:line="360" w:lineRule="auto"/>
+        <w:jc w:val="both"/>
+      </w:pPr>
+      <w:r>
+        <w:rPr>
+          <w:b/>
+          <w:bCs/>
+        </w:rPr>
+        <w:t>BIBLIOGRAFIA</w:t>
+      </w:r>
+    </w:p>
+    <w:p>
+      <w:pPr>
+        <w:pStyle w:val="Prrafodelista"/>
+        <w:spacing w:line="360" w:lineRule="auto"/>
+        <w:ind w:left="792"/>
+        <w:jc w:val="both"/>
+      </w:pPr>
+      <w:r>
+        <w:t xml:space="preserve">Pérez Aguilar, Juan; Robles Corella, Laura; otros. </w:t>
+      </w:r>
+      <w:r>
+        <w:rPr>
+          <w:b/>
+          <w:bCs/>
+          <w:u w:val="single"/>
+        </w:rPr>
+        <w:t xml:space="preserve">Formulación y evaluación de proyectos. </w:t>
+      </w:r>
+      <w:r>
+        <w:t>Editorial Limusa. Año 2016</w:t>
+      </w:r>
+    </w:p>
+    <w:p>
+      <w:pPr>
+        <w:pStyle w:val="Prrafodelista"/>
+        <w:spacing w:line="360" w:lineRule="auto"/>
+        <w:ind w:left="792"/>
+        <w:jc w:val="both"/>
+      </w:pPr>
+    </w:p>
+    <w:p>
+      <w:pPr>
+        <w:pStyle w:val="Prrafodelista"/>
+        <w:spacing w:line="360" w:lineRule="auto"/>
+        <w:ind w:left="792"/>
+        <w:jc w:val="both"/>
+      </w:pPr>
+      <w:r>
+        <w:t>Sitios Web</w:t>
+      </w:r>
+    </w:p>
+    <w:p>
+      <w:pPr>
+        <w:pStyle w:val="Prrafodelista"/>
+        <w:spacing w:line="360" w:lineRule="auto"/>
+        <w:ind w:left="792"/>
+        <w:jc w:val="both"/>
+      </w:pPr>
+      <w:r>
+        <w:t xml:space="preserve">Pérez Aguilar, Juan. Titulo, </w:t>
+      </w:r>
+      <w:hyperlink r:id="rId8" w:history="1">
+        <w:r>
+          <w:rPr>
+            <w:rStyle w:val="Hipervnculo"/>
+          </w:rPr>
+          <w:t>www.proyectosinformaticos.com</w:t>
+        </w:r>
+      </w:hyperlink>
+      <w:r>
+        <w:t xml:space="preserve"> 12-12-2018</w:t>
+      </w:r>
+    </w:p>
+    <w:p>
+      <w:pPr>
+        <w:pStyle w:val="Prrafodelista"/>
+        <w:numPr>
+          <w:ilvl w:val="1"/>
+          <w:numId w:val="2"/>
+        </w:numPr>
+        <w:spacing w:line="360" w:lineRule="auto"/>
+        <w:jc w:val="both"/>
+      </w:pPr>
+      <w:r>
+        <w:rPr>
+          <w:b/>
+          <w:bCs/>
+        </w:rPr>
+        <w:t>GLOSARIO</w:t>
+      </w:r>
+    </w:p>
+    <w:p>
+      <w:pPr>
+        <w:pStyle w:val="Prrafodelista"/>
+        <w:numPr>
+          <w:ilvl w:val="1"/>
+          <w:numId w:val="2"/>
+        </w:numPr>
+        <w:spacing w:line="360" w:lineRule="auto"/>
+        <w:jc w:val="both"/>
+      </w:pPr>
+      <w:r>
+        <w:rPr>
+          <w:b/>
+          <w:bCs/>
+        </w:rPr>
+        <w:t>ANEXOS</w:t>
+      </w:r>
+    </w:p>
+    <w:p>
+      <w:pPr>
+        <w:pStyle w:val="Prrafodelista"/>
+        <w:numPr>
+          <w:ilvl w:val="2"/>
+          <w:numId w:val="2"/>
+        </w:numPr>
+        <w:spacing w:line="360" w:lineRule="auto"/>
+        <w:jc w:val="both"/>
+      </w:pPr>
+      <w:r>
+        <w:rPr>
+          <w:b/>
+          <w:bCs/>
+        </w:rPr>
+        <w:t>CARTA SOLICITUD DEL PROYECTO EN LA EMPRESA</w:t>
+      </w:r>
+    </w:p>
+    <w:p>
+      <w:pPr>
+        <w:pStyle w:val="Prrafodelista"/>
+        <w:numPr>
+          <w:ilvl w:val="2"/>
+          <w:numId w:val="2"/>
+        </w:numPr>
+        <w:spacing w:line="360" w:lineRule="auto"/>
+        <w:jc w:val="both"/>
+      </w:pPr>
+      <w:r>
+        <w:rPr>
+          <w:b/>
+          <w:bCs/>
+        </w:rPr>
+        <w:t>CARTA APROBACIÓN DE LA EMPRESA</w:t>
+      </w:r>
+    </w:p>
     <w:sectPr>
-      <w:headerReference w:type="default" r:id="rId8"/>
-      <w:footerReference w:type="default" r:id="rId9"/>
+      <w:headerReference w:type="default" r:id="rId9"/>
+      <w:footerReference w:type="default" r:id="rId10"/>
       <w:pgSz w:w="12240" w:h="15840" w:code="1"/>
       <w:pgMar w:top="1418" w:right="1134" w:bottom="1418" w:left="1134" w:header="709" w:footer="709" w:gutter="0"/>
       <w:cols w:space="708"/>
@@ -711,6 +1589,7 @@
         <w:docPartUnique/>
       </w:docPartObj>
     </w:sdtPr>
+    <w:sdtEndPr/>
     <w:sdtContent>
       <w:p>
         <w:pPr>
@@ -742,6 +1621,9 @@
     <w:pPr>
       <w:pStyle w:val="Piedepgina"/>
     </w:pPr>
+    <w:r>
+      <w:t>SIGEPAN desarrollado por Y&amp;C SYSTEMS</w:t>
+    </w:r>
   </w:p>
 </w:ftr>
 </file>
@@ -779,6 +1661,9 @@
     </w:pPr>
     <w:r>
       <w:t>Proyecto Profesional Informático- Yilbert Fernández Espinoza</w:t>
+    </w:r>
+    <w:r>
+      <w:t xml:space="preserve"> y Cesar Campos Torres</w:t>
     </w:r>
   </w:p>
 </w:hdr>
@@ -880,8 +1765,221 @@
       </w:pPr>
     </w:lvl>
   </w:abstractNum>
+  <w:abstractNum w:abstractNumId="1" w15:restartNumberingAfterBreak="0">
+    <w:nsid w:val="254E6B27"/>
+    <w:multiLevelType w:val="multilevel"/>
+    <w:tmpl w:val="DAC8BAD4"/>
+    <w:lvl w:ilvl="0">
+      <w:start w:val="1"/>
+      <w:numFmt w:val="decimal"/>
+      <w:lvlText w:val="%1."/>
+      <w:lvlJc w:val="left"/>
+      <w:pPr>
+        <w:ind w:left="360" w:hanging="360"/>
+      </w:pPr>
+    </w:lvl>
+    <w:lvl w:ilvl="1">
+      <w:start w:val="1"/>
+      <w:numFmt w:val="decimal"/>
+      <w:lvlText w:val="%1.%2."/>
+      <w:lvlJc w:val="left"/>
+      <w:pPr>
+        <w:ind w:left="792" w:hanging="432"/>
+      </w:pPr>
+      <w:rPr>
+        <w:b/>
+        <w:bCs/>
+      </w:rPr>
+    </w:lvl>
+    <w:lvl w:ilvl="2">
+      <w:start w:val="1"/>
+      <w:numFmt w:val="decimal"/>
+      <w:lvlText w:val="%1.%2.%3."/>
+      <w:lvlJc w:val="left"/>
+      <w:pPr>
+        <w:ind w:left="1224" w:hanging="504"/>
+      </w:pPr>
+      <w:rPr>
+        <w:b/>
+        <w:bCs/>
+      </w:rPr>
+    </w:lvl>
+    <w:lvl w:ilvl="3">
+      <w:start w:val="1"/>
+      <w:numFmt w:val="decimal"/>
+      <w:lvlText w:val="%1.%2.%3.%4."/>
+      <w:lvlJc w:val="left"/>
+      <w:pPr>
+        <w:ind w:left="1728" w:hanging="648"/>
+      </w:pPr>
+    </w:lvl>
+    <w:lvl w:ilvl="4">
+      <w:start w:val="1"/>
+      <w:numFmt w:val="decimal"/>
+      <w:lvlText w:val="%1.%2.%3.%4.%5."/>
+      <w:lvlJc w:val="left"/>
+      <w:pPr>
+        <w:ind w:left="2232" w:hanging="792"/>
+      </w:pPr>
+    </w:lvl>
+    <w:lvl w:ilvl="5">
+      <w:start w:val="1"/>
+      <w:numFmt w:val="decimal"/>
+      <w:lvlText w:val="%1.%2.%3.%4.%5.%6."/>
+      <w:lvlJc w:val="left"/>
+      <w:pPr>
+        <w:ind w:left="2736" w:hanging="936"/>
+      </w:pPr>
+    </w:lvl>
+    <w:lvl w:ilvl="6">
+      <w:start w:val="1"/>
+      <w:numFmt w:val="decimal"/>
+      <w:lvlText w:val="%1.%2.%3.%4.%5.%6.%7."/>
+      <w:lvlJc w:val="left"/>
+      <w:pPr>
+        <w:ind w:left="3240" w:hanging="1080"/>
+      </w:pPr>
+    </w:lvl>
+    <w:lvl w:ilvl="7">
+      <w:start w:val="1"/>
+      <w:numFmt w:val="decimal"/>
+      <w:lvlText w:val="%1.%2.%3.%4.%5.%6.%7.%8."/>
+      <w:lvlJc w:val="left"/>
+      <w:pPr>
+        <w:ind w:left="3744" w:hanging="1224"/>
+      </w:pPr>
+    </w:lvl>
+    <w:lvl w:ilvl="8">
+      <w:start w:val="1"/>
+      <w:numFmt w:val="decimal"/>
+      <w:lvlText w:val="%1.%2.%3.%4.%5.%6.%7.%8.%9."/>
+      <w:lvlJc w:val="left"/>
+      <w:pPr>
+        <w:ind w:left="4320" w:hanging="1440"/>
+      </w:pPr>
+    </w:lvl>
+  </w:abstractNum>
+  <w:abstractNum w:abstractNumId="2" w15:restartNumberingAfterBreak="0">
+    <w:nsid w:val="7C8B25FB"/>
+    <w:multiLevelType w:val="hybridMultilevel"/>
+    <w:tmpl w:val="A17CC494"/>
+    <w:lvl w:ilvl="0" w:tplc="140A0001">
+      <w:start w:val="1"/>
+      <w:numFmt w:val="bullet"/>
+      <w:lvlText w:val=""/>
+      <w:lvlJc w:val="left"/>
+      <w:pPr>
+        <w:ind w:left="1944" w:hanging="360"/>
+      </w:pPr>
+      <w:rPr>
+        <w:rFonts w:ascii="Symbol" w:hAnsi="Symbol" w:hint="default"/>
+      </w:rPr>
+    </w:lvl>
+    <w:lvl w:ilvl="1" w:tplc="140A0003" w:tentative="1">
+      <w:start w:val="1"/>
+      <w:numFmt w:val="bullet"/>
+      <w:lvlText w:val="o"/>
+      <w:lvlJc w:val="left"/>
+      <w:pPr>
+        <w:ind w:left="2664" w:hanging="360"/>
+      </w:pPr>
+      <w:rPr>
+        <w:rFonts w:ascii="Courier New" w:hAnsi="Courier New" w:cs="Courier New" w:hint="default"/>
+      </w:rPr>
+    </w:lvl>
+    <w:lvl w:ilvl="2" w:tplc="140A0005" w:tentative="1">
+      <w:start w:val="1"/>
+      <w:numFmt w:val="bullet"/>
+      <w:lvlText w:val=""/>
+      <w:lvlJc w:val="left"/>
+      <w:pPr>
+        <w:ind w:left="3384" w:hanging="360"/>
+      </w:pPr>
+      <w:rPr>
+        <w:rFonts w:ascii="Wingdings" w:hAnsi="Wingdings" w:hint="default"/>
+      </w:rPr>
+    </w:lvl>
+    <w:lvl w:ilvl="3" w:tplc="140A0001" w:tentative="1">
+      <w:start w:val="1"/>
+      <w:numFmt w:val="bullet"/>
+      <w:lvlText w:val=""/>
+      <w:lvlJc w:val="left"/>
+      <w:pPr>
+        <w:ind w:left="4104" w:hanging="360"/>
+      </w:pPr>
+      <w:rPr>
+        <w:rFonts w:ascii="Symbol" w:hAnsi="Symbol" w:hint="default"/>
+      </w:rPr>
+    </w:lvl>
+    <w:lvl w:ilvl="4" w:tplc="140A0003" w:tentative="1">
+      <w:start w:val="1"/>
+      <w:numFmt w:val="bullet"/>
+      <w:lvlText w:val="o"/>
+      <w:lvlJc w:val="left"/>
+      <w:pPr>
+        <w:ind w:left="4824" w:hanging="360"/>
+      </w:pPr>
+      <w:rPr>
+        <w:rFonts w:ascii="Courier New" w:hAnsi="Courier New" w:cs="Courier New" w:hint="default"/>
+      </w:rPr>
+    </w:lvl>
+    <w:lvl w:ilvl="5" w:tplc="140A0005" w:tentative="1">
+      <w:start w:val="1"/>
+      <w:numFmt w:val="bullet"/>
+      <w:lvlText w:val=""/>
+      <w:lvlJc w:val="left"/>
+      <w:pPr>
+        <w:ind w:left="5544" w:hanging="360"/>
+      </w:pPr>
+      <w:rPr>
+        <w:rFonts w:ascii="Wingdings" w:hAnsi="Wingdings" w:hint="default"/>
+      </w:rPr>
+    </w:lvl>
+    <w:lvl w:ilvl="6" w:tplc="140A0001" w:tentative="1">
+      <w:start w:val="1"/>
+      <w:numFmt w:val="bullet"/>
+      <w:lvlText w:val=""/>
+      <w:lvlJc w:val="left"/>
+      <w:pPr>
+        <w:ind w:left="6264" w:hanging="360"/>
+      </w:pPr>
+      <w:rPr>
+        <w:rFonts w:ascii="Symbol" w:hAnsi="Symbol" w:hint="default"/>
+      </w:rPr>
+    </w:lvl>
+    <w:lvl w:ilvl="7" w:tplc="140A0003" w:tentative="1">
+      <w:start w:val="1"/>
+      <w:numFmt w:val="bullet"/>
+      <w:lvlText w:val="o"/>
+      <w:lvlJc w:val="left"/>
+      <w:pPr>
+        <w:ind w:left="6984" w:hanging="360"/>
+      </w:pPr>
+      <w:rPr>
+        <w:rFonts w:ascii="Courier New" w:hAnsi="Courier New" w:cs="Courier New" w:hint="default"/>
+      </w:rPr>
+    </w:lvl>
+    <w:lvl w:ilvl="8" w:tplc="140A0005" w:tentative="1">
+      <w:start w:val="1"/>
+      <w:numFmt w:val="bullet"/>
+      <w:lvlText w:val=""/>
+      <w:lvlJc w:val="left"/>
+      <w:pPr>
+        <w:ind w:left="7704" w:hanging="360"/>
+      </w:pPr>
+      <w:rPr>
+        <w:rFonts w:ascii="Wingdings" w:hAnsi="Wingdings" w:hint="default"/>
+      </w:rPr>
+    </w:lvl>
+  </w:abstractNum>
   <w:num w:numId="1">
     <w:abstractNumId w:val="0"/>
+  </w:num>
+  <w:num w:numId="2">
+    <w:abstractNumId w:val="1"/>
+  </w:num>
+  <w:num w:numId="3">
+    <w:abstractNumId w:val="2"/>
   </w:num>
 </w:numbering>
 </file>
@@ -1367,6 +2465,29 @@
       <w:contextualSpacing/>
     </w:pPr>
   </w:style>
+  <w:style w:type="character" w:styleId="Hipervnculo">
+    <w:name w:val="Hyperlink"/>
+    <w:basedOn w:val="Fuentedeprrafopredeter"/>
+    <w:uiPriority w:val="99"/>
+    <w:unhideWhenUsed/>
+    <w:rsid w:val="00D31CB7"/>
+    <w:rPr>
+      <w:color w:val="0563C1" w:themeColor="hyperlink"/>
+      <w:u w:val="single"/>
+    </w:rPr>
+  </w:style>
+  <w:style w:type="character" w:styleId="Mencinsinresolver">
+    <w:name w:val="Unresolved Mention"/>
+    <w:basedOn w:val="Fuentedeprrafopredeter"/>
+    <w:uiPriority w:val="99"/>
+    <w:semiHidden/>
+    <w:unhideWhenUsed/>
+    <w:rsid w:val="00D31CB7"/>
+    <w:rPr>
+      <w:color w:val="605E5C"/>
+      <w:shd w:val="clear" w:color="auto" w:fill="E1DFDD"/>
+    </w:rPr>
+  </w:style>
 </w:styles>
 </file>
 

</xml_diff>

<commit_message>
actualizacion de documentacion 2
</commit_message>
<xml_diff>
--- a/DOCUMENTACION/ENTREGABLE #1.docx
+++ b/DOCUMENTACION/ENTREGABLE #1.docx
@@ -737,19 +737,6 @@
         <w:jc w:val="both"/>
       </w:pPr>
       <w:r>
-        <w:t>El sistema será desarrollado utilizando el lenguaje de programación Python mediante el framework Django, junto con el motor de base de datos MYSQL, permitiendo contar con una plataforma</w:t>
-      </w:r>
-      <w:r>
-        <w:t xml:space="preserve"> moderna, segura y eficiente para el manejo de la información de la empresa.</w:t>
-      </w:r>
-    </w:p>
-    <w:p>
-      <w:pPr>
-        <w:spacing w:line="360" w:lineRule="auto"/>
-        <w:ind w:left="360" w:firstLine="348"/>
-        <w:jc w:val="both"/>
-      </w:pPr>
-      <w:r>
         <w:t>Con la implementación de este proyecto se espera mejorar la eficiencia operativa de la panadería, reducir errores administrativos, agilizar los procesos internos y facilitar la toma de decisiones mediante el acceso rápido y ordenado a la información.</w:t>
       </w:r>
     </w:p>
@@ -977,7 +964,7 @@
         <w:jc w:val="both"/>
       </w:pPr>
       <w:r>
-        <w:t>Desde el punto de vista tecnológico, el proyecto permitirá implementar herramientas modernas de desarrollo web utilizando Python, Django y MySQL, brindando una solución segura, escalable y adaptable a las necesidades de la empresa.</w:t>
+        <w:t>Además, este proyecto representa una oportunidad para aplicar los conocimientos adquiridos durante la formación académica, desarrollando una solución informática orientada a resolver una problemática real dentro de una empresa.</w:t>
       </w:r>
     </w:p>
     <w:p>
@@ -986,9 +973,13 @@
         <w:ind w:firstLine="360"/>
         <w:jc w:val="both"/>
       </w:pPr>
-      <w:r>
-        <w:t>Además, este proyecto representa una oportunidad para aplicar los conocimientos adquiridos durante la formación académica, desarrollando una solución informática orientada a resolver una problemática real dentro de una empresa.</w:t>
-      </w:r>
+    </w:p>
+    <w:p>
+      <w:pPr>
+        <w:spacing w:line="360" w:lineRule="auto"/>
+        <w:ind w:firstLine="360"/>
+        <w:jc w:val="both"/>
+      </w:pPr>
     </w:p>
     <w:p>
       <w:pPr>
@@ -1456,7 +1447,13 @@
         <w:jc w:val="both"/>
       </w:pPr>
       <w:r>
-        <w:t xml:space="preserve">Pérez Aguilar, Juan. Titulo, </w:t>
+        <w:t xml:space="preserve">Pérez Aguilar, Juan. </w:t>
+      </w:r>
+      <w:r>
+        <w:t>Título</w:t>
+      </w:r>
+      <w:r>
+        <w:t xml:space="preserve">, </w:t>
       </w:r>
       <w:hyperlink r:id="rId8" w:history="1">
         <w:r>

</xml_diff>

<commit_message>
actualizacion de entregable 1
</commit_message>
<xml_diff>
--- a/DOCUMENTACION/ENTREGABLE #1.docx
+++ b/DOCUMENTACION/ENTREGABLE #1.docx
@@ -1,6 +1,6 @@
 
 <file path=word/document.xml><?xml version="1.0" encoding="utf-8"?>
-<w:document xmlns:wpc="http://schemas.microsoft.com/office/word/2010/wordprocessingCanvas" xmlns:cx="http://schemas.microsoft.com/office/drawing/2014/chartex" xmlns:mc="http://schemas.openxmlformats.org/markup-compatibility/2006" xmlns:o="urn:schemas-microsoft-com:office:office" xmlns:r="http://schemas.openxmlformats.org/officeDocument/2006/relationships" xmlns:m="http://schemas.openxmlformats.org/officeDocument/2006/math" xmlns:v="urn:schemas-microsoft-com:vml" xmlns:wp14="http://schemas.microsoft.com/office/word/2010/wordprocessingDrawing" xmlns:wp="http://schemas.openxmlformats.org/drawingml/2006/wordprocessingDrawing" xmlns:w10="urn:schemas-microsoft-com:office:word" xmlns:w="http://schemas.openxmlformats.org/wordprocessingml/2006/main" xmlns:w14="http://schemas.microsoft.com/office/word/2010/wordml" xmlns:w15="http://schemas.microsoft.com/office/word/2012/wordml" xmlns:w16se="http://schemas.microsoft.com/office/word/2015/wordml/symex" xmlns:wpg="http://schemas.microsoft.com/office/word/2010/wordprocessingGroup" xmlns:wpi="http://schemas.microsoft.com/office/word/2010/wordprocessingInk" xmlns:wne="http://schemas.microsoft.com/office/word/2006/wordml" xmlns:wps="http://schemas.microsoft.com/office/word/2010/wordprocessingShape" mc:Ignorable="w14 w15 w16se wp14">
+<w:document xmlns:wpc="http://schemas.microsoft.com/office/word/2010/wordprocessingCanvas" xmlns:cx="http://schemas.microsoft.com/office/drawing/2014/chartex" xmlns:cx1="http://schemas.microsoft.com/office/drawing/2015/9/8/chartex" xmlns:cx2="http://schemas.microsoft.com/office/drawing/2015/10/21/chartex" xmlns:cx3="http://schemas.microsoft.com/office/drawing/2016/5/9/chartex" xmlns:cx4="http://schemas.microsoft.com/office/drawing/2016/5/10/chartex" xmlns:cx5="http://schemas.microsoft.com/office/drawing/2016/5/11/chartex" xmlns:cx6="http://schemas.microsoft.com/office/drawing/2016/5/12/chartex" xmlns:cx7="http://schemas.microsoft.com/office/drawing/2016/5/13/chartex" xmlns:cx8="http://schemas.microsoft.com/office/drawing/2016/5/14/chartex" xmlns:mc="http://schemas.openxmlformats.org/markup-compatibility/2006" xmlns:aink="http://schemas.microsoft.com/office/drawing/2016/ink" xmlns:am3d="http://schemas.microsoft.com/office/drawing/2017/model3d" xmlns:o="urn:schemas-microsoft-com:office:office" xmlns:r="http://schemas.openxmlformats.org/officeDocument/2006/relationships" xmlns:m="http://schemas.openxmlformats.org/officeDocument/2006/math" xmlns:v="urn:schemas-microsoft-com:vml" xmlns:wp14="http://schemas.microsoft.com/office/word/2010/wordprocessingDrawing" xmlns:wp="http://schemas.openxmlformats.org/drawingml/2006/wordprocessingDrawing" xmlns:w10="urn:schemas-microsoft-com:office:word" xmlns:w="http://schemas.openxmlformats.org/wordprocessingml/2006/main" xmlns:w14="http://schemas.microsoft.com/office/word/2010/wordml" xmlns:w15="http://schemas.microsoft.com/office/word/2012/wordml" xmlns:w16cex="http://schemas.microsoft.com/office/word/2018/wordml/cex" xmlns:w16cid="http://schemas.microsoft.com/office/word/2016/wordml/cid" xmlns:w16="http://schemas.microsoft.com/office/word/2018/wordml" xmlns:w16sdtdh="http://schemas.microsoft.com/office/word/2020/wordml/sdtdatahash" xmlns:w16se="http://schemas.microsoft.com/office/word/2015/wordml/symex" xmlns:wpg="http://schemas.microsoft.com/office/word/2010/wordprocessingGroup" xmlns:wpi="http://schemas.microsoft.com/office/word/2010/wordprocessingInk" xmlns:wne="http://schemas.microsoft.com/office/word/2006/wordml" xmlns:wps="http://schemas.microsoft.com/office/word/2010/wordprocessingShape" mc:Ignorable="w14 w15 w16se w16cid w16 w16cex w16sdtdh wp14">
   <w:body>
     <w:p>
       <w:pPr>
@@ -192,6 +192,13 @@
         </w:rPr>
         <w:t>YILBERT FERNÁNDEZ ESPINOZA</w:t>
       </w:r>
+      <w:r>
+        <w:rPr>
+          <w:sz w:val="32"/>
+          <w:szCs w:val="32"/>
+        </w:rPr>
+        <w:t xml:space="preserve"> 304880229</w:t>
+      </w:r>
     </w:p>
     <w:p>
       <w:pPr>
@@ -217,6 +224,13 @@
         </w:rPr>
         <w:t xml:space="preserve"> TORRES</w:t>
       </w:r>
+      <w:r>
+        <w:rPr>
+          <w:sz w:val="32"/>
+          <w:szCs w:val="32"/>
+        </w:rPr>
+        <w:t xml:space="preserve"> 114310767</w:t>
+      </w:r>
     </w:p>
     <w:p>
       <w:pPr>
@@ -228,12 +242,23 @@
           <w:szCs w:val="32"/>
         </w:rPr>
       </w:pPr>
-      <w:r>
+    </w:p>
+    <w:p>
+      <w:pPr>
+        <w:spacing w:line="360" w:lineRule="auto"/>
+        <w:ind w:left="708"/>
+        <w:jc w:val="center"/>
         <w:rPr>
           <w:sz w:val="32"/>
           <w:szCs w:val="32"/>
         </w:rPr>
-        <w:t>CÉDULA</w:t>
+      </w:pPr>
+      <w:r>
+        <w:rPr>
+          <w:sz w:val="32"/>
+          <w:szCs w:val="32"/>
+        </w:rPr>
+        <w:t>FECHA DE ENTREGA</w:t>
       </w:r>
     </w:p>
     <w:p>
@@ -251,21 +276,7 @@
           <w:sz w:val="32"/>
           <w:szCs w:val="32"/>
         </w:rPr>
-        <w:t>304880229</w:t>
-      </w:r>
-      <w:r>
-        <w:rPr>
-          <w:sz w:val="32"/>
-          <w:szCs w:val="32"/>
-        </w:rPr>
-        <w:br/>
-      </w:r>
-      <w:r>
-        <w:rPr>
-          <w:sz w:val="32"/>
-          <w:szCs w:val="32"/>
-        </w:rPr>
-        <w:t>114310767</w:t>
+        <w:t>22-05-2026</w:t>
       </w:r>
     </w:p>
     <w:p>
@@ -274,17 +285,10 @@
         <w:ind w:left="708"/>
         <w:jc w:val="center"/>
         <w:rPr>
-          <w:sz w:val="32"/>
-          <w:szCs w:val="32"/>
-        </w:rPr>
-      </w:pPr>
-      <w:r>
-        <w:rPr>
-          <w:sz w:val="32"/>
-          <w:szCs w:val="32"/>
-        </w:rPr>
-        <w:t>FECHA DE ENTREGA</w:t>
-      </w:r>
+          <w:b/>
+          <w:bCs/>
+        </w:rPr>
+      </w:pPr>
     </w:p>
     <w:p>
       <w:pPr>
@@ -292,17 +296,10 @@
         <w:ind w:left="708"/>
         <w:jc w:val="center"/>
         <w:rPr>
-          <w:sz w:val="32"/>
-          <w:szCs w:val="32"/>
-        </w:rPr>
-      </w:pPr>
-      <w:r>
-        <w:rPr>
-          <w:sz w:val="32"/>
-          <w:szCs w:val="32"/>
-        </w:rPr>
-        <w:t>22-05-2026</w:t>
-      </w:r>
+          <w:b/>
+          <w:bCs/>
+        </w:rPr>
+      </w:pPr>
     </w:p>
     <w:p>
       <w:pPr>
@@ -1244,21 +1241,7 @@
           <w:rFonts w:eastAsia="Times New Roman" w:cstheme="minorHAnsi"/>
           <w:lang w:val="es-419" w:eastAsia="es-419"/>
         </w:rPr>
-        <w:t xml:space="preserve">“Transformamos ingredientes de calidad en momentos de felicidad, con el empuje y la conciencia de nuestro equipo.” </w:t>
-      </w:r>
-      <w:r>
-        <w:rPr>
-          <w:rFonts w:ascii="Segoe UI Symbol" w:eastAsia="Times New Roman" w:hAnsi="Segoe UI Symbol" w:cs="Segoe UI Symbol"/>
-          <w:lang w:val="es-419" w:eastAsia="es-419"/>
-        </w:rPr>
-        <w:t>👉</w:t>
-      </w:r>
-      <w:r>
-        <w:rPr>
-          <w:rFonts w:eastAsia="Times New Roman" w:cstheme="minorHAnsi"/>
-          <w:lang w:val="es-419" w:eastAsia="es-419"/>
-        </w:rPr>
-        <w:t xml:space="preserve"> En términos prácticos: brindar productos frescos y sabrosos con atención cercana y confiable.</w:t>
+        <w:t>“Transformamos ingredientes de calidad en momentos de felicidad, con el empuje y la conciencia de nuestro equipo.”  En términos prácticos: brindar productos frescos y sabrosos con atención cercana y confiable.</w:t>
       </w:r>
     </w:p>
     <w:p>
@@ -1293,21 +1276,7 @@
           <w:rFonts w:eastAsia="Times New Roman" w:cstheme="minorHAnsi"/>
           <w:lang w:val="es-419" w:eastAsia="es-419"/>
         </w:rPr>
-        <w:t xml:space="preserve">“Ser una empresa referente por nuestra capacidad de evolucionar la tradición artesanal con innovación consciente, convirtiéndonos en una plataforma de bienestar compartido para nuestros clientes y colaboradores.” </w:t>
-      </w:r>
-      <w:r>
-        <w:rPr>
-          <w:rFonts w:ascii="Segoe UI Symbol" w:eastAsia="Times New Roman" w:hAnsi="Segoe UI Symbol" w:cs="Segoe UI Symbol"/>
-          <w:lang w:val="es-419" w:eastAsia="es-419"/>
-        </w:rPr>
-        <w:t>👉</w:t>
-      </w:r>
-      <w:r>
-        <w:rPr>
-          <w:rFonts w:eastAsia="Times New Roman" w:cstheme="minorHAnsi"/>
-          <w:lang w:val="es-419" w:eastAsia="es-419"/>
-        </w:rPr>
-        <w:t xml:space="preserve"> En términos prácticos: convertirse en una cadena reconocida en Costa Rica por calidad, servicio, innovación y procesos estandarizados.</w:t>
+        <w:t>“Ser una empresa referente por nuestra capacidad de evolucionar la tradición artesanal con innovación consciente, convirtiéndonos en una plataforma de bienestar compartido para nuestros clientes y colaboradores.” En términos prácticos: convertirse en una cadena reconocida en Costa Rica por calidad, servicio, innovación y procesos estandarizados.</w:t>
       </w:r>
     </w:p>
     <w:p>
@@ -1848,17 +1817,10 @@
       </w:pPr>
       <w:r>
         <w:rPr>
-          <w:rFonts w:ascii="Segoe UI Symbol" w:eastAsia="Times New Roman" w:hAnsi="Segoe UI Symbol" w:cs="Segoe UI Symbol"/>
-          <w:lang w:val="es-419" w:eastAsia="es-419"/>
-        </w:rPr>
-        <w:t>👉</w:t>
-      </w:r>
-      <w:r>
-        <w:rPr>
-          <w:rFonts w:eastAsia="Times New Roman" w:cstheme="minorHAnsi"/>
-          <w:lang w:val="es-419" w:eastAsia="es-419"/>
-        </w:rPr>
-        <w:t xml:space="preserve"> Para el MVP, el enfoque será únicamente en los </w:t>
+          <w:rFonts w:eastAsia="Times New Roman" w:cstheme="minorHAnsi"/>
+          <w:lang w:val="es-419" w:eastAsia="es-419"/>
+        </w:rPr>
+        <w:t xml:space="preserve">Para el MVP, el enfoque será únicamente en los </w:t>
       </w:r>
       <w:r>
         <w:rPr>
@@ -2660,8 +2622,6 @@
           <w:bCs/>
         </w:rPr>
       </w:pPr>
-      <w:bookmarkStart w:id="0" w:name="_GoBack"/>
-      <w:bookmarkEnd w:id="0"/>
     </w:p>
     <w:p>
       <w:pPr>
@@ -2947,7 +2907,7 @@
 </file>
 
 <file path=word/endnotes.xml><?xml version="1.0" encoding="utf-8"?>
-<w:endnotes xmlns:wpc="http://schemas.microsoft.com/office/word/2010/wordprocessingCanvas" xmlns:cx="http://schemas.microsoft.com/office/drawing/2014/chartex" xmlns:mc="http://schemas.openxmlformats.org/markup-compatibility/2006" xmlns:o="urn:schemas-microsoft-com:office:office" xmlns:r="http://schemas.openxmlformats.org/officeDocument/2006/relationships" xmlns:m="http://schemas.openxmlformats.org/officeDocument/2006/math" xmlns:v="urn:schemas-microsoft-com:vml" xmlns:wp14="http://schemas.microsoft.com/office/word/2010/wordprocessingDrawing" xmlns:wp="http://schemas.openxmlformats.org/drawingml/2006/wordprocessingDrawing" xmlns:w10="urn:schemas-microsoft-com:office:word" xmlns:w="http://schemas.openxmlformats.org/wordprocessingml/2006/main" xmlns:w14="http://schemas.microsoft.com/office/word/2010/wordml" xmlns:w15="http://schemas.microsoft.com/office/word/2012/wordml" xmlns:w16se="http://schemas.microsoft.com/office/word/2015/wordml/symex" xmlns:wpg="http://schemas.microsoft.com/office/word/2010/wordprocessingGroup" xmlns:wpi="http://schemas.microsoft.com/office/word/2010/wordprocessingInk" xmlns:wne="http://schemas.microsoft.com/office/word/2006/wordml" xmlns:wps="http://schemas.microsoft.com/office/word/2010/wordprocessingShape" mc:Ignorable="w14 w15 w16se wp14">
+<w:endnotes xmlns:wpc="http://schemas.microsoft.com/office/word/2010/wordprocessingCanvas" xmlns:cx="http://schemas.microsoft.com/office/drawing/2014/chartex" xmlns:cx1="http://schemas.microsoft.com/office/drawing/2015/9/8/chartex" xmlns:cx2="http://schemas.microsoft.com/office/drawing/2015/10/21/chartex" xmlns:cx3="http://schemas.microsoft.com/office/drawing/2016/5/9/chartex" xmlns:cx4="http://schemas.microsoft.com/office/drawing/2016/5/10/chartex" xmlns:cx5="http://schemas.microsoft.com/office/drawing/2016/5/11/chartex" xmlns:cx6="http://schemas.microsoft.com/office/drawing/2016/5/12/chartex" xmlns:cx7="http://schemas.microsoft.com/office/drawing/2016/5/13/chartex" xmlns:cx8="http://schemas.microsoft.com/office/drawing/2016/5/14/chartex" xmlns:mc="http://schemas.openxmlformats.org/markup-compatibility/2006" xmlns:aink="http://schemas.microsoft.com/office/drawing/2016/ink" xmlns:am3d="http://schemas.microsoft.com/office/drawing/2017/model3d" xmlns:o="urn:schemas-microsoft-com:office:office" xmlns:r="http://schemas.openxmlformats.org/officeDocument/2006/relationships" xmlns:m="http://schemas.openxmlformats.org/officeDocument/2006/math" xmlns:v="urn:schemas-microsoft-com:vml" xmlns:wp14="http://schemas.microsoft.com/office/word/2010/wordprocessingDrawing" xmlns:wp="http://schemas.openxmlformats.org/drawingml/2006/wordprocessingDrawing" xmlns:w10="urn:schemas-microsoft-com:office:word" xmlns:w="http://schemas.openxmlformats.org/wordprocessingml/2006/main" xmlns:w14="http://schemas.microsoft.com/office/word/2010/wordml" xmlns:w15="http://schemas.microsoft.com/office/word/2012/wordml" xmlns:w16cex="http://schemas.microsoft.com/office/word/2018/wordml/cex" xmlns:w16cid="http://schemas.microsoft.com/office/word/2016/wordml/cid" xmlns:w16="http://schemas.microsoft.com/office/word/2018/wordml" xmlns:w16sdtdh="http://schemas.microsoft.com/office/word/2020/wordml/sdtdatahash" xmlns:w16se="http://schemas.microsoft.com/office/word/2015/wordml/symex" xmlns:wpg="http://schemas.microsoft.com/office/word/2010/wordprocessingGroup" xmlns:wpi="http://schemas.microsoft.com/office/word/2010/wordprocessingInk" xmlns:wne="http://schemas.microsoft.com/office/word/2006/wordml" xmlns:wps="http://schemas.microsoft.com/office/word/2010/wordprocessingShape" mc:Ignorable="w14 w15 w16se w16cid w16 w16cex w16sdtdh wp14">
   <w:endnote w:type="separator" w:id="-1">
     <w:p>
       <w:pPr>
@@ -2972,7 +2932,7 @@
 </file>
 
 <file path=word/footer1.xml><?xml version="1.0" encoding="utf-8"?>
-<w:ftr xmlns:wpc="http://schemas.microsoft.com/office/word/2010/wordprocessingCanvas" xmlns:cx="http://schemas.microsoft.com/office/drawing/2014/chartex" xmlns:mc="http://schemas.openxmlformats.org/markup-compatibility/2006" xmlns:o="urn:schemas-microsoft-com:office:office" xmlns:r="http://schemas.openxmlformats.org/officeDocument/2006/relationships" xmlns:m="http://schemas.openxmlformats.org/officeDocument/2006/math" xmlns:v="urn:schemas-microsoft-com:vml" xmlns:wp14="http://schemas.microsoft.com/office/word/2010/wordprocessingDrawing" xmlns:wp="http://schemas.openxmlformats.org/drawingml/2006/wordprocessingDrawing" xmlns:w10="urn:schemas-microsoft-com:office:word" xmlns:w="http://schemas.openxmlformats.org/wordprocessingml/2006/main" xmlns:w14="http://schemas.microsoft.com/office/word/2010/wordml" xmlns:w15="http://schemas.microsoft.com/office/word/2012/wordml" xmlns:w16se="http://schemas.microsoft.com/office/word/2015/wordml/symex" xmlns:wpg="http://schemas.microsoft.com/office/word/2010/wordprocessingGroup" xmlns:wpi="http://schemas.microsoft.com/office/word/2010/wordprocessingInk" xmlns:wne="http://schemas.microsoft.com/office/word/2006/wordml" xmlns:wps="http://schemas.microsoft.com/office/word/2010/wordprocessingShape" mc:Ignorable="w14 w15 w16se wp14">
+<w:ftr xmlns:wpc="http://schemas.microsoft.com/office/word/2010/wordprocessingCanvas" xmlns:cx="http://schemas.microsoft.com/office/drawing/2014/chartex" xmlns:cx1="http://schemas.microsoft.com/office/drawing/2015/9/8/chartex" xmlns:cx2="http://schemas.microsoft.com/office/drawing/2015/10/21/chartex" xmlns:cx3="http://schemas.microsoft.com/office/drawing/2016/5/9/chartex" xmlns:cx4="http://schemas.microsoft.com/office/drawing/2016/5/10/chartex" xmlns:cx5="http://schemas.microsoft.com/office/drawing/2016/5/11/chartex" xmlns:cx6="http://schemas.microsoft.com/office/drawing/2016/5/12/chartex" xmlns:cx7="http://schemas.microsoft.com/office/drawing/2016/5/13/chartex" xmlns:cx8="http://schemas.microsoft.com/office/drawing/2016/5/14/chartex" xmlns:mc="http://schemas.openxmlformats.org/markup-compatibility/2006" xmlns:aink="http://schemas.microsoft.com/office/drawing/2016/ink" xmlns:am3d="http://schemas.microsoft.com/office/drawing/2017/model3d" xmlns:o="urn:schemas-microsoft-com:office:office" xmlns:r="http://schemas.openxmlformats.org/officeDocument/2006/relationships" xmlns:m="http://schemas.openxmlformats.org/officeDocument/2006/math" xmlns:v="urn:schemas-microsoft-com:vml" xmlns:wp14="http://schemas.microsoft.com/office/word/2010/wordprocessingDrawing" xmlns:wp="http://schemas.openxmlformats.org/drawingml/2006/wordprocessingDrawing" xmlns:w10="urn:schemas-microsoft-com:office:word" xmlns:w="http://schemas.openxmlformats.org/wordprocessingml/2006/main" xmlns:w14="http://schemas.microsoft.com/office/word/2010/wordml" xmlns:w15="http://schemas.microsoft.com/office/word/2012/wordml" xmlns:w16cex="http://schemas.microsoft.com/office/word/2018/wordml/cex" xmlns:w16cid="http://schemas.microsoft.com/office/word/2016/wordml/cid" xmlns:w16="http://schemas.microsoft.com/office/word/2018/wordml" xmlns:w16sdtdh="http://schemas.microsoft.com/office/word/2020/wordml/sdtdatahash" xmlns:w16se="http://schemas.microsoft.com/office/word/2015/wordml/symex" xmlns:wpg="http://schemas.microsoft.com/office/word/2010/wordprocessingGroup" xmlns:wpi="http://schemas.microsoft.com/office/word/2010/wordprocessingInk" xmlns:wne="http://schemas.microsoft.com/office/word/2006/wordml" xmlns:wps="http://schemas.microsoft.com/office/word/2010/wordprocessingShape" mc:Ignorable="w14 w15 w16se w16cid w16 w16cex w16sdtdh wp14">
   <w:sdt>
     <w:sdtPr>
       <w:id w:val="1154792906"/>
@@ -3022,7 +2982,7 @@
 </file>
 
 <file path=word/footnotes.xml><?xml version="1.0" encoding="utf-8"?>
-<w:footnotes xmlns:wpc="http://schemas.microsoft.com/office/word/2010/wordprocessingCanvas" xmlns:cx="http://schemas.microsoft.com/office/drawing/2014/chartex" xmlns:mc="http://schemas.openxmlformats.org/markup-compatibility/2006" xmlns:o="urn:schemas-microsoft-com:office:office" xmlns:r="http://schemas.openxmlformats.org/officeDocument/2006/relationships" xmlns:m="http://schemas.openxmlformats.org/officeDocument/2006/math" xmlns:v="urn:schemas-microsoft-com:vml" xmlns:wp14="http://schemas.microsoft.com/office/word/2010/wordprocessingDrawing" xmlns:wp="http://schemas.openxmlformats.org/drawingml/2006/wordprocessingDrawing" xmlns:w10="urn:schemas-microsoft-com:office:word" xmlns:w="http://schemas.openxmlformats.org/wordprocessingml/2006/main" xmlns:w14="http://schemas.microsoft.com/office/word/2010/wordml" xmlns:w15="http://schemas.microsoft.com/office/word/2012/wordml" xmlns:w16se="http://schemas.microsoft.com/office/word/2015/wordml/symex" xmlns:wpg="http://schemas.microsoft.com/office/word/2010/wordprocessingGroup" xmlns:wpi="http://schemas.microsoft.com/office/word/2010/wordprocessingInk" xmlns:wne="http://schemas.microsoft.com/office/word/2006/wordml" xmlns:wps="http://schemas.microsoft.com/office/word/2010/wordprocessingShape" mc:Ignorable="w14 w15 w16se wp14">
+<w:footnotes xmlns:wpc="http://schemas.microsoft.com/office/word/2010/wordprocessingCanvas" xmlns:cx="http://schemas.microsoft.com/office/drawing/2014/chartex" xmlns:cx1="http://schemas.microsoft.com/office/drawing/2015/9/8/chartex" xmlns:cx2="http://schemas.microsoft.com/office/drawing/2015/10/21/chartex" xmlns:cx3="http://schemas.microsoft.com/office/drawing/2016/5/9/chartex" xmlns:cx4="http://schemas.microsoft.com/office/drawing/2016/5/10/chartex" xmlns:cx5="http://schemas.microsoft.com/office/drawing/2016/5/11/chartex" xmlns:cx6="http://schemas.microsoft.com/office/drawing/2016/5/12/chartex" xmlns:cx7="http://schemas.microsoft.com/office/drawing/2016/5/13/chartex" xmlns:cx8="http://schemas.microsoft.com/office/drawing/2016/5/14/chartex" xmlns:mc="http://schemas.openxmlformats.org/markup-compatibility/2006" xmlns:aink="http://schemas.microsoft.com/office/drawing/2016/ink" xmlns:am3d="http://schemas.microsoft.com/office/drawing/2017/model3d" xmlns:o="urn:schemas-microsoft-com:office:office" xmlns:r="http://schemas.openxmlformats.org/officeDocument/2006/relationships" xmlns:m="http://schemas.openxmlformats.org/officeDocument/2006/math" xmlns:v="urn:schemas-microsoft-com:vml" xmlns:wp14="http://schemas.microsoft.com/office/word/2010/wordprocessingDrawing" xmlns:wp="http://schemas.openxmlformats.org/drawingml/2006/wordprocessingDrawing" xmlns:w10="urn:schemas-microsoft-com:office:word" xmlns:w="http://schemas.openxmlformats.org/wordprocessingml/2006/main" xmlns:w14="http://schemas.microsoft.com/office/word/2010/wordml" xmlns:w15="http://schemas.microsoft.com/office/word/2012/wordml" xmlns:w16cex="http://schemas.microsoft.com/office/word/2018/wordml/cex" xmlns:w16cid="http://schemas.microsoft.com/office/word/2016/wordml/cid" xmlns:w16="http://schemas.microsoft.com/office/word/2018/wordml" xmlns:w16sdtdh="http://schemas.microsoft.com/office/word/2020/wordml/sdtdatahash" xmlns:w16se="http://schemas.microsoft.com/office/word/2015/wordml/symex" xmlns:wpg="http://schemas.microsoft.com/office/word/2010/wordprocessingGroup" xmlns:wpi="http://schemas.microsoft.com/office/word/2010/wordprocessingInk" xmlns:wne="http://schemas.microsoft.com/office/word/2006/wordml" xmlns:wps="http://schemas.microsoft.com/office/word/2010/wordprocessingShape" mc:Ignorable="w14 w15 w16se w16cid w16 w16cex w16sdtdh wp14">
   <w:footnote w:type="separator" w:id="-1">
     <w:p>
       <w:pPr>
@@ -3047,7 +3007,7 @@
 </file>
 
 <file path=word/header1.xml><?xml version="1.0" encoding="utf-8"?>
-<w:hdr xmlns:wpc="http://schemas.microsoft.com/office/word/2010/wordprocessingCanvas" xmlns:cx="http://schemas.microsoft.com/office/drawing/2014/chartex" xmlns:mc="http://schemas.openxmlformats.org/markup-compatibility/2006" xmlns:o="urn:schemas-microsoft-com:office:office" xmlns:r="http://schemas.openxmlformats.org/officeDocument/2006/relationships" xmlns:m="http://schemas.openxmlformats.org/officeDocument/2006/math" xmlns:v="urn:schemas-microsoft-com:vml" xmlns:wp14="http://schemas.microsoft.com/office/word/2010/wordprocessingDrawing" xmlns:wp="http://schemas.openxmlformats.org/drawingml/2006/wordprocessingDrawing" xmlns:w10="urn:schemas-microsoft-com:office:word" xmlns:w="http://schemas.openxmlformats.org/wordprocessingml/2006/main" xmlns:w14="http://schemas.microsoft.com/office/word/2010/wordml" xmlns:w15="http://schemas.microsoft.com/office/word/2012/wordml" xmlns:w16se="http://schemas.microsoft.com/office/word/2015/wordml/symex" xmlns:wpg="http://schemas.microsoft.com/office/word/2010/wordprocessingGroup" xmlns:wpi="http://schemas.microsoft.com/office/word/2010/wordprocessingInk" xmlns:wne="http://schemas.microsoft.com/office/word/2006/wordml" xmlns:wps="http://schemas.microsoft.com/office/word/2010/wordprocessingShape" mc:Ignorable="w14 w15 w16se wp14">
+<w:hdr xmlns:wpc="http://schemas.microsoft.com/office/word/2010/wordprocessingCanvas" xmlns:cx="http://schemas.microsoft.com/office/drawing/2014/chartex" xmlns:cx1="http://schemas.microsoft.com/office/drawing/2015/9/8/chartex" xmlns:cx2="http://schemas.microsoft.com/office/drawing/2015/10/21/chartex" xmlns:cx3="http://schemas.microsoft.com/office/drawing/2016/5/9/chartex" xmlns:cx4="http://schemas.microsoft.com/office/drawing/2016/5/10/chartex" xmlns:cx5="http://schemas.microsoft.com/office/drawing/2016/5/11/chartex" xmlns:cx6="http://schemas.microsoft.com/office/drawing/2016/5/12/chartex" xmlns:cx7="http://schemas.microsoft.com/office/drawing/2016/5/13/chartex" xmlns:cx8="http://schemas.microsoft.com/office/drawing/2016/5/14/chartex" xmlns:mc="http://schemas.openxmlformats.org/markup-compatibility/2006" xmlns:aink="http://schemas.microsoft.com/office/drawing/2016/ink" xmlns:am3d="http://schemas.microsoft.com/office/drawing/2017/model3d" xmlns:o="urn:schemas-microsoft-com:office:office" xmlns:r="http://schemas.openxmlformats.org/officeDocument/2006/relationships" xmlns:m="http://schemas.openxmlformats.org/officeDocument/2006/math" xmlns:v="urn:schemas-microsoft-com:vml" xmlns:wp14="http://schemas.microsoft.com/office/word/2010/wordprocessingDrawing" xmlns:wp="http://schemas.openxmlformats.org/drawingml/2006/wordprocessingDrawing" xmlns:w10="urn:schemas-microsoft-com:office:word" xmlns:w="http://schemas.openxmlformats.org/wordprocessingml/2006/main" xmlns:w14="http://schemas.microsoft.com/office/word/2010/wordml" xmlns:w15="http://schemas.microsoft.com/office/word/2012/wordml" xmlns:w16cex="http://schemas.microsoft.com/office/word/2018/wordml/cex" xmlns:w16cid="http://schemas.microsoft.com/office/word/2016/wordml/cid" xmlns:w16="http://schemas.microsoft.com/office/word/2018/wordml" xmlns:w16sdtdh="http://schemas.microsoft.com/office/word/2020/wordml/sdtdatahash" xmlns:w16se="http://schemas.microsoft.com/office/word/2015/wordml/symex" xmlns:wpg="http://schemas.microsoft.com/office/word/2010/wordprocessingGroup" xmlns:wpi="http://schemas.microsoft.com/office/word/2010/wordprocessingInk" xmlns:wne="http://schemas.microsoft.com/office/word/2006/wordml" xmlns:wps="http://schemas.microsoft.com/office/word/2010/wordprocessingShape" mc:Ignorable="w14 w15 w16se w16cid w16 w16cex w16sdtdh wp14">
   <w:p>
     <w:pPr>
       <w:pStyle w:val="Encabezado"/>
@@ -3063,7 +3023,7 @@
 </file>
 
 <file path=word/numbering.xml><?xml version="1.0" encoding="utf-8"?>
-<w:numbering xmlns:wpc="http://schemas.microsoft.com/office/word/2010/wordprocessingCanvas" xmlns:cx="http://schemas.microsoft.com/office/drawing/2014/chartex" xmlns:mc="http://schemas.openxmlformats.org/markup-compatibility/2006" xmlns:o="urn:schemas-microsoft-com:office:office" xmlns:r="http://schemas.openxmlformats.org/officeDocument/2006/relationships" xmlns:m="http://schemas.openxmlformats.org/officeDocument/2006/math" xmlns:v="urn:schemas-microsoft-com:vml" xmlns:wp14="http://schemas.microsoft.com/office/word/2010/wordprocessingDrawing" xmlns:wp="http://schemas.openxmlformats.org/drawingml/2006/wordprocessingDrawing" xmlns:w10="urn:schemas-microsoft-com:office:word" xmlns:w="http://schemas.openxmlformats.org/wordprocessingml/2006/main" xmlns:w14="http://schemas.microsoft.com/office/word/2010/wordml" xmlns:w15="http://schemas.microsoft.com/office/word/2012/wordml" xmlns:w16se="http://schemas.microsoft.com/office/word/2015/wordml/symex" xmlns:wpg="http://schemas.microsoft.com/office/word/2010/wordprocessingGroup" xmlns:wpi="http://schemas.microsoft.com/office/word/2010/wordprocessingInk" xmlns:wne="http://schemas.microsoft.com/office/word/2006/wordml" xmlns:wps="http://schemas.microsoft.com/office/word/2010/wordprocessingShape" mc:Ignorable="w14 w15 w16se wp14">
+<w:numbering xmlns:wpc="http://schemas.microsoft.com/office/word/2010/wordprocessingCanvas" xmlns:cx="http://schemas.microsoft.com/office/drawing/2014/chartex" xmlns:cx1="http://schemas.microsoft.com/office/drawing/2015/9/8/chartex" xmlns:cx2="http://schemas.microsoft.com/office/drawing/2015/10/21/chartex" xmlns:cx3="http://schemas.microsoft.com/office/drawing/2016/5/9/chartex" xmlns:cx4="http://schemas.microsoft.com/office/drawing/2016/5/10/chartex" xmlns:cx5="http://schemas.microsoft.com/office/drawing/2016/5/11/chartex" xmlns:cx6="http://schemas.microsoft.com/office/drawing/2016/5/12/chartex" xmlns:cx7="http://schemas.microsoft.com/office/drawing/2016/5/13/chartex" xmlns:cx8="http://schemas.microsoft.com/office/drawing/2016/5/14/chartex" xmlns:mc="http://schemas.openxmlformats.org/markup-compatibility/2006" xmlns:aink="http://schemas.microsoft.com/office/drawing/2016/ink" xmlns:am3d="http://schemas.microsoft.com/office/drawing/2017/model3d" xmlns:o="urn:schemas-microsoft-com:office:office" xmlns:r="http://schemas.openxmlformats.org/officeDocument/2006/relationships" xmlns:m="http://schemas.openxmlformats.org/officeDocument/2006/math" xmlns:v="urn:schemas-microsoft-com:vml" xmlns:wp14="http://schemas.microsoft.com/office/word/2010/wordprocessingDrawing" xmlns:wp="http://schemas.openxmlformats.org/drawingml/2006/wordprocessingDrawing" xmlns:w10="urn:schemas-microsoft-com:office:word" xmlns:w="http://schemas.openxmlformats.org/wordprocessingml/2006/main" xmlns:w14="http://schemas.microsoft.com/office/word/2010/wordml" xmlns:w15="http://schemas.microsoft.com/office/word/2012/wordml" xmlns:w16cex="http://schemas.microsoft.com/office/word/2018/wordml/cex" xmlns:w16cid="http://schemas.microsoft.com/office/word/2016/wordml/cid" xmlns:w16="http://schemas.microsoft.com/office/word/2018/wordml" xmlns:w16sdtdh="http://schemas.microsoft.com/office/word/2020/wordml/sdtdatahash" xmlns:w16se="http://schemas.microsoft.com/office/word/2015/wordml/symex" xmlns:wpg="http://schemas.microsoft.com/office/word/2010/wordprocessingGroup" xmlns:wpi="http://schemas.microsoft.com/office/word/2010/wordprocessingInk" xmlns:wne="http://schemas.microsoft.com/office/word/2006/wordml" xmlns:wps="http://schemas.microsoft.com/office/word/2010/wordprocessingShape" mc:Ignorable="w14 w15 w16se w16cid w16 w16cex w16sdtdh wp14">
   <w:abstractNum w:abstractNumId="0" w15:restartNumberingAfterBreak="0">
     <w:nsid w:val="043637E7"/>
     <w:multiLevelType w:val="multilevel"/>
@@ -4102,7 +4062,7 @@
 </file>
 
 <file path=word/styles.xml><?xml version="1.0" encoding="utf-8"?>
-<w:styles xmlns:mc="http://schemas.openxmlformats.org/markup-compatibility/2006" xmlns:r="http://schemas.openxmlformats.org/officeDocument/2006/relationships" xmlns:w="http://schemas.openxmlformats.org/wordprocessingml/2006/main" xmlns:w14="http://schemas.microsoft.com/office/word/2010/wordml" xmlns:w15="http://schemas.microsoft.com/office/word/2012/wordml" xmlns:w16se="http://schemas.microsoft.com/office/word/2015/wordml/symex" mc:Ignorable="w14 w15 w16se">
+<w:styles xmlns:mc="http://schemas.openxmlformats.org/markup-compatibility/2006" xmlns:r="http://schemas.openxmlformats.org/officeDocument/2006/relationships" xmlns:w="http://schemas.openxmlformats.org/wordprocessingml/2006/main" xmlns:w14="http://schemas.microsoft.com/office/word/2010/wordml" xmlns:w15="http://schemas.microsoft.com/office/word/2012/wordml" xmlns:w16cex="http://schemas.microsoft.com/office/word/2018/wordml/cex" xmlns:w16cid="http://schemas.microsoft.com/office/word/2016/wordml/cid" xmlns:w16="http://schemas.microsoft.com/office/word/2018/wordml" xmlns:w16sdtdh="http://schemas.microsoft.com/office/word/2020/wordml/sdtdatahash" xmlns:w16se="http://schemas.microsoft.com/office/word/2015/wordml/symex" mc:Ignorable="w14 w15 w16se w16cid w16 w16cex w16sdtdh">
   <w:docDefaults>
     <w:rPrDefault>
       <w:rPr>
@@ -4118,7 +4078,7 @@
       </w:pPr>
     </w:pPrDefault>
   </w:docDefaults>
-  <w:latentStyles w:defLockedState="0" w:defUIPriority="99" w:defSemiHidden="0" w:defUnhideWhenUsed="0" w:defQFormat="0" w:count="371">
+  <w:latentStyles w:defLockedState="0" w:defUIPriority="99" w:defSemiHidden="0" w:defUnhideWhenUsed="0" w:defQFormat="0" w:count="376">
     <w:lsdException w:name="Normal" w:uiPriority="0" w:qFormat="1"/>
     <w:lsdException w:name="heading 1" w:uiPriority="9" w:qFormat="1"/>
     <w:lsdException w:name="heading 2" w:semiHidden="1" w:uiPriority="9" w:unhideWhenUsed="1" w:qFormat="1"/>
@@ -4224,7 +4184,6 @@
     <w:lsdException w:name="HTML Sample" w:semiHidden="1" w:unhideWhenUsed="1"/>
     <w:lsdException w:name="HTML Typewriter" w:semiHidden="1" w:unhideWhenUsed="1"/>
     <w:lsdException w:name="HTML Variable" w:semiHidden="1" w:unhideWhenUsed="1"/>
-    <w:lsdException w:name="Normal Table" w:semiHidden="1" w:unhideWhenUsed="1"/>
     <w:lsdException w:name="annotation subject" w:semiHidden="1" w:unhideWhenUsed="1"/>
     <w:lsdException w:name="No List" w:semiHidden="1" w:unhideWhenUsed="1"/>
     <w:lsdException w:name="Outline List 1" w:semiHidden="1" w:unhideWhenUsed="1"/>
@@ -4267,11 +4226,8 @@
     <w:lsdException w:name="Table Contemporary" w:semiHidden="1" w:unhideWhenUsed="1"/>
     <w:lsdException w:name="Table Elegant" w:semiHidden="1" w:unhideWhenUsed="1"/>
     <w:lsdException w:name="Table Professional" w:semiHidden="1" w:unhideWhenUsed="1"/>
-    <w:lsdException w:name="Table Subtle 1" w:semiHidden="1" w:unhideWhenUsed="1"/>
     <w:lsdException w:name="Table Subtle 2" w:semiHidden="1" w:unhideWhenUsed="1"/>
     <w:lsdException w:name="Table Web 1" w:semiHidden="1" w:unhideWhenUsed="1"/>
-    <w:lsdException w:name="Table Web 2" w:semiHidden="1" w:unhideWhenUsed="1"/>
-    <w:lsdException w:name="Table Web 3" w:semiHidden="1" w:unhideWhenUsed="1"/>
     <w:lsdException w:name="Balloon Text" w:semiHidden="1" w:unhideWhenUsed="1"/>
     <w:lsdException w:name="Table Grid" w:uiPriority="39"/>
     <w:lsdException w:name="Table Theme" w:semiHidden="1" w:unhideWhenUsed="1"/>
@@ -4490,6 +4446,11 @@
     <w:lsdException w:name="List Table 5 Dark Accent 6" w:uiPriority="50"/>
     <w:lsdException w:name="List Table 6 Colorful Accent 6" w:uiPriority="51"/>
     <w:lsdException w:name="List Table 7 Colorful Accent 6" w:uiPriority="52"/>
+    <w:lsdException w:name="Mention" w:semiHidden="1" w:unhideWhenUsed="1"/>
+    <w:lsdException w:name="Smart Hyperlink" w:semiHidden="1" w:unhideWhenUsed="1"/>
+    <w:lsdException w:name="Hashtag" w:semiHidden="1" w:unhideWhenUsed="1"/>
+    <w:lsdException w:name="Unresolved Mention" w:semiHidden="1" w:unhideWhenUsed="1"/>
+    <w:lsdException w:name="Smart Link" w:semiHidden="1" w:unhideWhenUsed="1"/>
   </w:latentStyles>
   <w:style w:type="paragraph" w:default="1" w:styleId="Normal">
     <w:name w:val="Normal"/>
@@ -4588,8 +4549,8 @@
       <w:u w:val="single"/>
     </w:rPr>
   </w:style>
-  <w:style w:type="character" w:customStyle="1" w:styleId="UnresolvedMention">
-    <w:name w:val="Unresolved Mention"/>
+  <w:style w:type="character" w:customStyle="1" w:styleId="Mencinsinresolver1">
+    <w:name w:val="Mención sin resolver1"/>
     <w:basedOn w:val="Fuentedeprrafopredeter"/>
     <w:uiPriority w:val="99"/>
     <w:semiHidden/>

</xml_diff>